<commit_message>
Week 5: AI review record and requirements updated after review
</commit_message>
<xml_diff>
--- a/week5/Stage_2_SmartCare_v02_Requirements_Template.docx
+++ b/week5/Stage_2_SmartCare_v02_Requirements_Template.docx
@@ -551,10 +551,10 @@
     </w:p>
     <w:p>
       <w:r>
-        <w:t xml:space="preserve">FR-09: </w:t>
-      </w:r>
-      <w:r>
-        <w:t>The system shall show each practitioner's appointments for any day the receptionist picks.</w:t>
+        <w:t>FR-09: The system shall show each practitioner's booked appointments and free time slots for any day the receptionist picks</w:t>
+      </w:r>
+      <w:r>
+        <w:t>.</w:t>
       </w:r>
     </w:p>
     <w:p>
@@ -588,16 +588,7 @@
     </w:p>
     <w:p>
       <w:r>
-        <w:t>NFR-01</w:t>
-      </w:r>
-      <w:r>
-        <w:t>(Data integrity)</w:t>
-      </w:r>
-      <w:r>
-        <w:t xml:space="preserve">: </w:t>
-      </w:r>
-      <w:r>
-        <w:t>The system shall not save a patient or appointment if the name or time is left empty.</w:t>
+        <w:t>NFR-01 (Data integrity): The system shall not save a patient if the patient name is empty, or an appointment if the appointment time is empty.</w:t>
       </w:r>
     </w:p>
     <w:p>
@@ -730,6 +721,7 @@
     </w:p>
     <w:p>
       <w:r>
+        <w:lastRenderedPageBreak/>
         <w:t xml:space="preserve">US-02: As a </w:t>
       </w:r>
       <w:r>
@@ -762,7 +754,6 @@
     </w:p>
     <w:p>
       <w:r>
-        <w:lastRenderedPageBreak/>
         <w:t xml:space="preserve">US-03: As a </w:t>
       </w:r>
       <w:r>
@@ -934,10 +925,7 @@
         <w:t>JRL</w:t>
       </w:r>
       <w:r>
-        <w:t xml:space="preserve"> </w:t>
-      </w:r>
-      <w:r>
-        <w:t>already has someone booked at 10:00 on 3 October</w:t>
+        <w:t xml:space="preserve"> already has someone booked at 10:00 on 3 October</w:t>
       </w:r>
       <w:r>
         <w:br/>
@@ -1047,6 +1035,12 @@
         </w:rPr>
         <w:t>The numbers in NFR-03 and NFR-06 (5 steps, 2 seconds, 5,000 patients) are our own guesses. The client didn't give us any figures.</w:t>
       </w:r>
+      <w:r>
+        <w:rPr>
+          <w:lang w:val="en-AU"/>
+        </w:rPr>
+        <w:t xml:space="preserve"> </w:t>
+      </w:r>
     </w:p>
     <w:p>
       <w:pPr>
@@ -1145,6 +1139,7 @@
         <w:rPr>
           <w:lang w:val="en-AU"/>
         </w:rPr>
+        <w:lastRenderedPageBreak/>
         <w:t>Should receptionists be able to reschedule appointments, or just cancel and book again?</w:t>
       </w:r>
     </w:p>
@@ -1179,7 +1174,6 @@
         <w:rPr>
           <w:lang w:val="en-AU"/>
         </w:rPr>
-        <w:lastRenderedPageBreak/>
         <w:t>Does the manager need any reports? If so, what should be in them?</w:t>
       </w:r>
     </w:p>
@@ -1198,6 +1192,34 @@
           <w:lang w:val="en-AU"/>
         </w:rPr>
         <w:t>How long is an appointment, and what hours is the clinic open?</w:t>
+      </w:r>
+    </w:p>
+    <w:p>
+      <w:pPr>
+        <w:numPr>
+          <w:ilvl w:val="0"/>
+          <w:numId w:val="17"/>
+        </w:numPr>
+        <w:rPr>
+          <w:lang w:val="en-AU"/>
+        </w:rPr>
+      </w:pPr>
+      <w:r>
+        <w:t>Who marks an appointment as Completed, and when?</w:t>
+      </w:r>
+    </w:p>
+    <w:p>
+      <w:pPr>
+        <w:numPr>
+          <w:ilvl w:val="0"/>
+          <w:numId w:val="17"/>
+        </w:numPr>
+        <w:rPr>
+          <w:lang w:val="en-AU"/>
+        </w:rPr>
+      </w:pPr>
+      <w:r>
+        <w:t>Are patient names unique, or could two patients share the same name?</w:t>
       </w:r>
     </w:p>
     <w:p/>
@@ -1279,31 +1301,73 @@
           <w:tcPr>
             <w:tcW w:w="2045" w:type="dxa"/>
           </w:tcPr>
-          <w:p/>
+          <w:p>
+            <w:r>
+              <w:t>NFR-01 says "name" without saying whose name</w:t>
+            </w:r>
+          </w:p>
         </w:tc>
         <w:tc>
           <w:tcPr>
             <w:tcW w:w="2045" w:type="dxa"/>
           </w:tcPr>
-          <w:p/>
+          <w:p>
+            <w:r>
+              <w:t>Copilot: evidence</w:t>
+            </w:r>
+            <w:r>
+              <w:t xml:space="preserve"> </w:t>
+            </w:r>
+            <w:r>
+              <w:t>based. I agree, it's unclear.</w:t>
+            </w:r>
+          </w:p>
         </w:tc>
         <w:tc>
           <w:tcPr>
             <w:tcW w:w="2045" w:type="dxa"/>
           </w:tcPr>
-          <w:p/>
+          <w:p>
+            <w:r>
+              <w:t>Modified</w:t>
+            </w:r>
+          </w:p>
         </w:tc>
         <w:tc>
           <w:tcPr>
             <w:tcW w:w="2045" w:type="dxa"/>
           </w:tcPr>
-          <w:p/>
+          <w:p>
+            <w:r>
+              <w:t xml:space="preserve">My Week 4 bug was blank </w:t>
+            </w:r>
+            <w:r>
+              <w:rPr>
+                <w:i/>
+                <w:iCs/>
+              </w:rPr>
+              <w:t>patient</w:t>
+            </w:r>
+            <w:r>
+              <w:t xml:space="preserve"> names, so I reworded NFR-01 to </w:t>
+            </w:r>
+            <w:r>
+              <w:t>say,</w:t>
+            </w:r>
+            <w:r>
+              <w:t xml:space="preserve"> patient name" and "appointment time".</w:t>
+            </w:r>
+          </w:p>
         </w:tc>
         <w:tc>
           <w:tcPr>
             <w:tcW w:w="2045" w:type="dxa"/>
           </w:tcPr>
-          <w:p/>
+          <w:p>
+            <w:r>
+              <w:t>Re-read NFR-01 and my Week 4 notes on blank names</w:t>
+            </w:r>
+          </w:p>
         </w:tc>
       </w:tr>
       <w:tr>
@@ -1311,31 +1375,63 @@
           <w:tcPr>
             <w:tcW w:w="2045" w:type="dxa"/>
           </w:tcPr>
-          <w:p/>
+          <w:p>
+            <w:r>
+              <w:t>FR-09 and FR-10 only show booked appointments, not when practitioners are free</w:t>
+            </w:r>
+          </w:p>
         </w:tc>
         <w:tc>
           <w:tcPr>
             <w:tcW w:w="2045" w:type="dxa"/>
           </w:tcPr>
-          <w:p/>
+          <w:p>
+            <w:r>
+              <w:t xml:space="preserve">Copilot: </w:t>
+            </w:r>
+            <w:r>
+              <w:t>evidence based</w:t>
+            </w:r>
+            <w:r>
+              <w:t>. I agree, the case study says practitioner availability is hard to see.</w:t>
+            </w:r>
+          </w:p>
         </w:tc>
         <w:tc>
           <w:tcPr>
             <w:tcW w:w="2045" w:type="dxa"/>
           </w:tcPr>
-          <w:p/>
+          <w:p>
+            <w:r>
+              <w:t>Accepted</w:t>
+            </w:r>
+          </w:p>
         </w:tc>
         <w:tc>
           <w:tcPr>
             <w:tcW w:w="2045" w:type="dxa"/>
           </w:tcPr>
-          <w:p/>
+          <w:p>
+            <w:r>
+              <w:t>This is a real gap. I changed FR-</w:t>
+            </w:r>
+            <w:r>
+              <w:t>09,</w:t>
+            </w:r>
+            <w:r>
+              <w:t xml:space="preserve"> so it also shows free time slots.</w:t>
+            </w:r>
+          </w:p>
         </w:tc>
         <w:tc>
           <w:tcPr>
             <w:tcW w:w="2045" w:type="dxa"/>
           </w:tcPr>
-          <w:p/>
+          <w:p>
+            <w:r>
+              <w:t>Checked the case study problem list and the Evidence column in my stakeholder table</w:t>
+            </w:r>
+          </w:p>
         </w:tc>
       </w:tr>
       <w:tr>
@@ -1343,31 +1439,51 @@
           <w:tcPr>
             <w:tcW w:w="2045" w:type="dxa"/>
           </w:tcPr>
-          <w:p/>
+          <w:p>
+            <w:r>
+              <w:t>No one is responsible for marking appointments as "Completed"</w:t>
+            </w:r>
+          </w:p>
         </w:tc>
         <w:tc>
           <w:tcPr>
             <w:tcW w:w="2045" w:type="dxa"/>
           </w:tcPr>
-          <w:p/>
+          <w:p>
+            <w:r>
+              <w:t>Copilot: question. I agree, the client never said who does this.</w:t>
+            </w:r>
+          </w:p>
         </w:tc>
         <w:tc>
           <w:tcPr>
             <w:tcW w:w="2045" w:type="dxa"/>
           </w:tcPr>
-          <w:p/>
+          <w:p>
+            <w:r>
+              <w:t xml:space="preserve">Unverified </w:t>
+            </w:r>
+          </w:p>
         </w:tc>
         <w:tc>
           <w:tcPr>
             <w:tcW w:w="2045" w:type="dxa"/>
           </w:tcPr>
-          <w:p/>
+          <w:p>
+            <w:r>
+              <w:t>I don't want to guess who marks it or when, so I added it to my open questions in section 7.</w:t>
+            </w:r>
+          </w:p>
         </w:tc>
         <w:tc>
           <w:tcPr>
             <w:tcW w:w="2045" w:type="dxa"/>
           </w:tcPr>
-          <w:p/>
+          <w:p>
+            <w:r>
+              <w:t>Searched the case study for "completed" and found nothing</w:t>
+            </w:r>
+          </w:p>
         </w:tc>
       </w:tr>
       <w:tr>
@@ -1375,31 +1491,69 @@
           <w:tcPr>
             <w:tcW w:w="2045" w:type="dxa"/>
           </w:tcPr>
-          <w:p/>
+          <w:p>
+            <w:r>
+              <w:t>Reports aren't linked to any FR</w:t>
+            </w:r>
+          </w:p>
         </w:tc>
         <w:tc>
           <w:tcPr>
             <w:tcW w:w="2045" w:type="dxa"/>
           </w:tcPr>
-          <w:p/>
+          <w:p>
+            <w:r>
+              <w:t xml:space="preserve">Copilot: </w:t>
+            </w:r>
+            <w:r>
+              <w:t>evidence based</w:t>
+            </w:r>
+            <w:r>
+              <w:t xml:space="preserve">. Only partly right, because I left </w:t>
+            </w:r>
+            <w:r>
+              <w:t>report</w:t>
+            </w:r>
+            <w:r>
+              <w:t xml:space="preserve"> out on purpose.</w:t>
+            </w:r>
+          </w:p>
         </w:tc>
         <w:tc>
           <w:tcPr>
             <w:tcW w:w="2045" w:type="dxa"/>
           </w:tcPr>
-          <w:p/>
+          <w:p>
+            <w:r>
+              <w:t xml:space="preserve">Modified </w:t>
+            </w:r>
+          </w:p>
         </w:tc>
         <w:tc>
           <w:tcPr>
             <w:tcW w:w="2045" w:type="dxa"/>
           </w:tcPr>
-          <w:p/>
+          <w:p>
+            <w:r>
+              <w:t>The case study mentions reports but doesn't say which ones. I didn't add an FR. I marked reports as Provisional in section 1 instead.</w:t>
+            </w:r>
+          </w:p>
         </w:tc>
         <w:tc>
           <w:tcPr>
             <w:tcW w:w="2045" w:type="dxa"/>
           </w:tcPr>
-          <w:p/>
+          <w:p>
+            <w:r>
+              <w:t xml:space="preserve">Checked my section 7 open questions and my </w:t>
+            </w:r>
+            <w:r>
+              <w:t>in</w:t>
+            </w:r>
+            <w:r>
+              <w:t xml:space="preserve"> scope list</w:t>
+            </w:r>
+          </w:p>
         </w:tc>
       </w:tr>
       <w:tr>
@@ -1407,31 +1561,63 @@
           <w:tcPr>
             <w:tcW w:w="2045" w:type="dxa"/>
           </w:tcPr>
-          <w:p/>
+          <w:p>
+            <w:r>
+              <w:t>Add validation for phone numbers and future dates of birth</w:t>
+            </w:r>
+          </w:p>
         </w:tc>
         <w:tc>
           <w:tcPr>
             <w:tcW w:w="2045" w:type="dxa"/>
           </w:tcPr>
-          <w:p/>
+          <w:p>
+            <w:r>
+              <w:t>Copilot: suggestion. I disagree that there's evidence for it.</w:t>
+            </w:r>
+          </w:p>
         </w:tc>
         <w:tc>
           <w:tcPr>
             <w:tcW w:w="2045" w:type="dxa"/>
           </w:tcPr>
-          <w:p/>
+          <w:p>
+            <w:r>
+              <w:t xml:space="preserve">Rejected </w:t>
+            </w:r>
+          </w:p>
         </w:tc>
         <w:tc>
           <w:tcPr>
             <w:tcW w:w="2045" w:type="dxa"/>
           </w:tcPr>
-          <w:p/>
+          <w:p>
+            <w:r>
+              <w:t xml:space="preserve">The client never mentioned these rules, so adding them would mean </w:t>
+            </w:r>
+            <w:r>
+              <w:t>introducing</w:t>
+            </w:r>
+            <w:r>
+              <w:t xml:space="preserve"> requirements.</w:t>
+            </w:r>
+          </w:p>
         </w:tc>
         <w:tc>
           <w:tcPr>
             <w:tcW w:w="2045" w:type="dxa"/>
           </w:tcPr>
-          <w:p/>
+          <w:p>
+            <w:r>
+              <w:t>Re</w:t>
+            </w:r>
+            <w:r>
+              <w:t xml:space="preserve"> </w:t>
+            </w:r>
+            <w:r>
+              <w:t>read the case study and found no mention of phone or date of birth rules</w:t>
+            </w:r>
+          </w:p>
         </w:tc>
       </w:tr>
     </w:tbl>
@@ -1620,6 +1806,304 @@
     </w:lvl>
   </w:abstractNum>
   <w:abstractNum w:abstractNumId="9" w15:restartNumberingAfterBreak="0">
+    <w:nsid w:val="053B56E1"/>
+    <w:multiLevelType w:val="multilevel"/>
+    <w:tmpl w:val="7886233C"/>
+    <w:lvl w:ilvl="0">
+      <w:start w:val="1"/>
+      <w:numFmt w:val="bullet"/>
+      <w:lvlText w:val=""/>
+      <w:lvlJc w:val="left"/>
+      <w:pPr>
+        <w:tabs>
+          <w:tab w:val="num" w:pos="720"/>
+        </w:tabs>
+        <w:ind w:left="720" w:hanging="360"/>
+      </w:pPr>
+      <w:rPr>
+        <w:rFonts w:ascii="Symbol" w:hAnsi="Symbol" w:hint="default"/>
+        <w:sz w:val="20"/>
+      </w:rPr>
+    </w:lvl>
+    <w:lvl w:ilvl="1" w:tentative="1">
+      <w:start w:val="1"/>
+      <w:numFmt w:val="bullet"/>
+      <w:lvlText w:val="o"/>
+      <w:lvlJc w:val="left"/>
+      <w:pPr>
+        <w:tabs>
+          <w:tab w:val="num" w:pos="1440"/>
+        </w:tabs>
+        <w:ind w:left="1440" w:hanging="360"/>
+      </w:pPr>
+      <w:rPr>
+        <w:rFonts w:ascii="Courier New" w:hAnsi="Courier New" w:hint="default"/>
+        <w:sz w:val="20"/>
+      </w:rPr>
+    </w:lvl>
+    <w:lvl w:ilvl="2" w:tentative="1">
+      <w:start w:val="1"/>
+      <w:numFmt w:val="bullet"/>
+      <w:lvlText w:val=""/>
+      <w:lvlJc w:val="left"/>
+      <w:pPr>
+        <w:tabs>
+          <w:tab w:val="num" w:pos="2160"/>
+        </w:tabs>
+        <w:ind w:left="2160" w:hanging="360"/>
+      </w:pPr>
+      <w:rPr>
+        <w:rFonts w:ascii="Wingdings" w:hAnsi="Wingdings" w:hint="default"/>
+        <w:sz w:val="20"/>
+      </w:rPr>
+    </w:lvl>
+    <w:lvl w:ilvl="3" w:tentative="1">
+      <w:start w:val="1"/>
+      <w:numFmt w:val="bullet"/>
+      <w:lvlText w:val=""/>
+      <w:lvlJc w:val="left"/>
+      <w:pPr>
+        <w:tabs>
+          <w:tab w:val="num" w:pos="2880"/>
+        </w:tabs>
+        <w:ind w:left="2880" w:hanging="360"/>
+      </w:pPr>
+      <w:rPr>
+        <w:rFonts w:ascii="Wingdings" w:hAnsi="Wingdings" w:hint="default"/>
+        <w:sz w:val="20"/>
+      </w:rPr>
+    </w:lvl>
+    <w:lvl w:ilvl="4" w:tentative="1">
+      <w:start w:val="1"/>
+      <w:numFmt w:val="bullet"/>
+      <w:lvlText w:val=""/>
+      <w:lvlJc w:val="left"/>
+      <w:pPr>
+        <w:tabs>
+          <w:tab w:val="num" w:pos="3600"/>
+        </w:tabs>
+        <w:ind w:left="3600" w:hanging="360"/>
+      </w:pPr>
+      <w:rPr>
+        <w:rFonts w:ascii="Wingdings" w:hAnsi="Wingdings" w:hint="default"/>
+        <w:sz w:val="20"/>
+      </w:rPr>
+    </w:lvl>
+    <w:lvl w:ilvl="5" w:tentative="1">
+      <w:start w:val="1"/>
+      <w:numFmt w:val="bullet"/>
+      <w:lvlText w:val=""/>
+      <w:lvlJc w:val="left"/>
+      <w:pPr>
+        <w:tabs>
+          <w:tab w:val="num" w:pos="4320"/>
+        </w:tabs>
+        <w:ind w:left="4320" w:hanging="360"/>
+      </w:pPr>
+      <w:rPr>
+        <w:rFonts w:ascii="Wingdings" w:hAnsi="Wingdings" w:hint="default"/>
+        <w:sz w:val="20"/>
+      </w:rPr>
+    </w:lvl>
+    <w:lvl w:ilvl="6" w:tentative="1">
+      <w:start w:val="1"/>
+      <w:numFmt w:val="bullet"/>
+      <w:lvlText w:val=""/>
+      <w:lvlJc w:val="left"/>
+      <w:pPr>
+        <w:tabs>
+          <w:tab w:val="num" w:pos="5040"/>
+        </w:tabs>
+        <w:ind w:left="5040" w:hanging="360"/>
+      </w:pPr>
+      <w:rPr>
+        <w:rFonts w:ascii="Wingdings" w:hAnsi="Wingdings" w:hint="default"/>
+        <w:sz w:val="20"/>
+      </w:rPr>
+    </w:lvl>
+    <w:lvl w:ilvl="7" w:tentative="1">
+      <w:start w:val="1"/>
+      <w:numFmt w:val="bullet"/>
+      <w:lvlText w:val=""/>
+      <w:lvlJc w:val="left"/>
+      <w:pPr>
+        <w:tabs>
+          <w:tab w:val="num" w:pos="5760"/>
+        </w:tabs>
+        <w:ind w:left="5760" w:hanging="360"/>
+      </w:pPr>
+      <w:rPr>
+        <w:rFonts w:ascii="Wingdings" w:hAnsi="Wingdings" w:hint="default"/>
+        <w:sz w:val="20"/>
+      </w:rPr>
+    </w:lvl>
+    <w:lvl w:ilvl="8" w:tentative="1">
+      <w:start w:val="1"/>
+      <w:numFmt w:val="bullet"/>
+      <w:lvlText w:val=""/>
+      <w:lvlJc w:val="left"/>
+      <w:pPr>
+        <w:tabs>
+          <w:tab w:val="num" w:pos="6480"/>
+        </w:tabs>
+        <w:ind w:left="6480" w:hanging="360"/>
+      </w:pPr>
+      <w:rPr>
+        <w:rFonts w:ascii="Wingdings" w:hAnsi="Wingdings" w:hint="default"/>
+        <w:sz w:val="20"/>
+      </w:rPr>
+    </w:lvl>
+  </w:abstractNum>
+  <w:abstractNum w:abstractNumId="10" w15:restartNumberingAfterBreak="0">
+    <w:nsid w:val="0DBB734E"/>
+    <w:multiLevelType w:val="multilevel"/>
+    <w:tmpl w:val="B554C408"/>
+    <w:lvl w:ilvl="0">
+      <w:start w:val="1"/>
+      <w:numFmt w:val="bullet"/>
+      <w:lvlText w:val=""/>
+      <w:lvlJc w:val="left"/>
+      <w:pPr>
+        <w:tabs>
+          <w:tab w:val="num" w:pos="720"/>
+        </w:tabs>
+        <w:ind w:left="720" w:hanging="360"/>
+      </w:pPr>
+      <w:rPr>
+        <w:rFonts w:ascii="Symbol" w:hAnsi="Symbol" w:hint="default"/>
+        <w:sz w:val="20"/>
+      </w:rPr>
+    </w:lvl>
+    <w:lvl w:ilvl="1" w:tentative="1">
+      <w:start w:val="1"/>
+      <w:numFmt w:val="bullet"/>
+      <w:lvlText w:val="o"/>
+      <w:lvlJc w:val="left"/>
+      <w:pPr>
+        <w:tabs>
+          <w:tab w:val="num" w:pos="1440"/>
+        </w:tabs>
+        <w:ind w:left="1440" w:hanging="360"/>
+      </w:pPr>
+      <w:rPr>
+        <w:rFonts w:ascii="Courier New" w:hAnsi="Courier New" w:hint="default"/>
+        <w:sz w:val="20"/>
+      </w:rPr>
+    </w:lvl>
+    <w:lvl w:ilvl="2" w:tentative="1">
+      <w:start w:val="1"/>
+      <w:numFmt w:val="bullet"/>
+      <w:lvlText w:val=""/>
+      <w:lvlJc w:val="left"/>
+      <w:pPr>
+        <w:tabs>
+          <w:tab w:val="num" w:pos="2160"/>
+        </w:tabs>
+        <w:ind w:left="2160" w:hanging="360"/>
+      </w:pPr>
+      <w:rPr>
+        <w:rFonts w:ascii="Wingdings" w:hAnsi="Wingdings" w:hint="default"/>
+        <w:sz w:val="20"/>
+      </w:rPr>
+    </w:lvl>
+    <w:lvl w:ilvl="3" w:tentative="1">
+      <w:start w:val="1"/>
+      <w:numFmt w:val="bullet"/>
+      <w:lvlText w:val=""/>
+      <w:lvlJc w:val="left"/>
+      <w:pPr>
+        <w:tabs>
+          <w:tab w:val="num" w:pos="2880"/>
+        </w:tabs>
+        <w:ind w:left="2880" w:hanging="360"/>
+      </w:pPr>
+      <w:rPr>
+        <w:rFonts w:ascii="Wingdings" w:hAnsi="Wingdings" w:hint="default"/>
+        <w:sz w:val="20"/>
+      </w:rPr>
+    </w:lvl>
+    <w:lvl w:ilvl="4" w:tentative="1">
+      <w:start w:val="1"/>
+      <w:numFmt w:val="bullet"/>
+      <w:lvlText w:val=""/>
+      <w:lvlJc w:val="left"/>
+      <w:pPr>
+        <w:tabs>
+          <w:tab w:val="num" w:pos="3600"/>
+        </w:tabs>
+        <w:ind w:left="3600" w:hanging="360"/>
+      </w:pPr>
+      <w:rPr>
+        <w:rFonts w:ascii="Wingdings" w:hAnsi="Wingdings" w:hint="default"/>
+        <w:sz w:val="20"/>
+      </w:rPr>
+    </w:lvl>
+    <w:lvl w:ilvl="5" w:tentative="1">
+      <w:start w:val="1"/>
+      <w:numFmt w:val="bullet"/>
+      <w:lvlText w:val=""/>
+      <w:lvlJc w:val="left"/>
+      <w:pPr>
+        <w:tabs>
+          <w:tab w:val="num" w:pos="4320"/>
+        </w:tabs>
+        <w:ind w:left="4320" w:hanging="360"/>
+      </w:pPr>
+      <w:rPr>
+        <w:rFonts w:ascii="Wingdings" w:hAnsi="Wingdings" w:hint="default"/>
+        <w:sz w:val="20"/>
+      </w:rPr>
+    </w:lvl>
+    <w:lvl w:ilvl="6" w:tentative="1">
+      <w:start w:val="1"/>
+      <w:numFmt w:val="bullet"/>
+      <w:lvlText w:val=""/>
+      <w:lvlJc w:val="left"/>
+      <w:pPr>
+        <w:tabs>
+          <w:tab w:val="num" w:pos="5040"/>
+        </w:tabs>
+        <w:ind w:left="5040" w:hanging="360"/>
+      </w:pPr>
+      <w:rPr>
+        <w:rFonts w:ascii="Wingdings" w:hAnsi="Wingdings" w:hint="default"/>
+        <w:sz w:val="20"/>
+      </w:rPr>
+    </w:lvl>
+    <w:lvl w:ilvl="7" w:tentative="1">
+      <w:start w:val="1"/>
+      <w:numFmt w:val="bullet"/>
+      <w:lvlText w:val=""/>
+      <w:lvlJc w:val="left"/>
+      <w:pPr>
+        <w:tabs>
+          <w:tab w:val="num" w:pos="5760"/>
+        </w:tabs>
+        <w:ind w:left="5760" w:hanging="360"/>
+      </w:pPr>
+      <w:rPr>
+        <w:rFonts w:ascii="Wingdings" w:hAnsi="Wingdings" w:hint="default"/>
+        <w:sz w:val="20"/>
+      </w:rPr>
+    </w:lvl>
+    <w:lvl w:ilvl="8" w:tentative="1">
+      <w:start w:val="1"/>
+      <w:numFmt w:val="bullet"/>
+      <w:lvlText w:val=""/>
+      <w:lvlJc w:val="left"/>
+      <w:pPr>
+        <w:tabs>
+          <w:tab w:val="num" w:pos="6480"/>
+        </w:tabs>
+        <w:ind w:left="6480" w:hanging="360"/>
+      </w:pPr>
+      <w:rPr>
+        <w:rFonts w:ascii="Wingdings" w:hAnsi="Wingdings" w:hint="default"/>
+        <w:sz w:val="20"/>
+      </w:rPr>
+    </w:lvl>
+  </w:abstractNum>
+  <w:abstractNum w:abstractNumId="11" w15:restartNumberingAfterBreak="0">
     <w:nsid w:val="184679D6"/>
     <w:multiLevelType w:val="multilevel"/>
     <w:tmpl w:val="D90648A4"/>
@@ -1768,7 +2252,7 @@
       </w:rPr>
     </w:lvl>
   </w:abstractNum>
-  <w:abstractNum w:abstractNumId="10" w15:restartNumberingAfterBreak="0">
+  <w:abstractNum w:abstractNumId="12" w15:restartNumberingAfterBreak="0">
     <w:nsid w:val="25E32D87"/>
     <w:multiLevelType w:val="multilevel"/>
     <w:tmpl w:val="C53AFACA"/>
@@ -1917,7 +2401,7 @@
       </w:rPr>
     </w:lvl>
   </w:abstractNum>
-  <w:abstractNum w:abstractNumId="11" w15:restartNumberingAfterBreak="0">
+  <w:abstractNum w:abstractNumId="13" w15:restartNumberingAfterBreak="0">
     <w:nsid w:val="346C612B"/>
     <w:multiLevelType w:val="multilevel"/>
     <w:tmpl w:val="F2E60C84"/>
@@ -2066,7 +2550,7 @@
       </w:rPr>
     </w:lvl>
   </w:abstractNum>
-  <w:abstractNum w:abstractNumId="12" w15:restartNumberingAfterBreak="0">
+  <w:abstractNum w:abstractNumId="14" w15:restartNumberingAfterBreak="0">
     <w:nsid w:val="3A4E7B1B"/>
     <w:multiLevelType w:val="hybridMultilevel"/>
     <w:tmpl w:val="0AC8D768"/>
@@ -2155,7 +2639,7 @@
       </w:pPr>
     </w:lvl>
   </w:abstractNum>
-  <w:abstractNum w:abstractNumId="13" w15:restartNumberingAfterBreak="0">
+  <w:abstractNum w:abstractNumId="15" w15:restartNumberingAfterBreak="0">
     <w:nsid w:val="45D23B0D"/>
     <w:multiLevelType w:val="multilevel"/>
     <w:tmpl w:val="4CBAEF6A"/>
@@ -2304,7 +2788,7 @@
       </w:rPr>
     </w:lvl>
   </w:abstractNum>
-  <w:abstractNum w:abstractNumId="14" w15:restartNumberingAfterBreak="0">
+  <w:abstractNum w:abstractNumId="16" w15:restartNumberingAfterBreak="0">
     <w:nsid w:val="4C24442F"/>
     <w:multiLevelType w:val="multilevel"/>
     <w:tmpl w:val="E8AC9740"/>
@@ -2453,7 +2937,7 @@
       </w:rPr>
     </w:lvl>
   </w:abstractNum>
-  <w:abstractNum w:abstractNumId="15" w15:restartNumberingAfterBreak="0">
+  <w:abstractNum w:abstractNumId="17" w15:restartNumberingAfterBreak="0">
     <w:nsid w:val="57824E53"/>
     <w:multiLevelType w:val="multilevel"/>
     <w:tmpl w:val="2FD8E300"/>
@@ -2602,7 +3086,7 @@
       </w:rPr>
     </w:lvl>
   </w:abstractNum>
-  <w:abstractNum w:abstractNumId="16" w15:restartNumberingAfterBreak="0">
+  <w:abstractNum w:abstractNumId="18" w15:restartNumberingAfterBreak="0">
     <w:nsid w:val="69D67756"/>
     <w:multiLevelType w:val="multilevel"/>
     <w:tmpl w:val="E33067C4"/>
@@ -2779,28 +3263,34 @@
     <w:abstractNumId w:val="0"/>
   </w:num>
   <w:num w:numId="10" w16cid:durableId="1207763340">
+    <w:abstractNumId w:val="14"/>
+  </w:num>
+  <w:num w:numId="11" w16cid:durableId="452331445">
+    <w:abstractNumId w:val="17"/>
+  </w:num>
+  <w:num w:numId="12" w16cid:durableId="408231922">
+    <w:abstractNumId w:val="18"/>
+  </w:num>
+  <w:num w:numId="13" w16cid:durableId="971178851">
+    <w:abstractNumId w:val="13"/>
+  </w:num>
+  <w:num w:numId="14" w16cid:durableId="2023386142">
+    <w:abstractNumId w:val="16"/>
+  </w:num>
+  <w:num w:numId="15" w16cid:durableId="586232050">
+    <w:abstractNumId w:val="15"/>
+  </w:num>
+  <w:num w:numId="16" w16cid:durableId="159734073">
+    <w:abstractNumId w:val="11"/>
+  </w:num>
+  <w:num w:numId="17" w16cid:durableId="1307856197">
     <w:abstractNumId w:val="12"/>
   </w:num>
-  <w:num w:numId="11" w16cid:durableId="452331445">
-    <w:abstractNumId w:val="15"/>
+  <w:num w:numId="18" w16cid:durableId="2071532442">
+    <w:abstractNumId w:val="10"/>
   </w:num>
-  <w:num w:numId="12" w16cid:durableId="408231922">
-    <w:abstractNumId w:val="16"/>
-  </w:num>
-  <w:num w:numId="13" w16cid:durableId="971178851">
-    <w:abstractNumId w:val="11"/>
-  </w:num>
-  <w:num w:numId="14" w16cid:durableId="2023386142">
-    <w:abstractNumId w:val="14"/>
-  </w:num>
-  <w:num w:numId="15" w16cid:durableId="586232050">
-    <w:abstractNumId w:val="13"/>
-  </w:num>
-  <w:num w:numId="16" w16cid:durableId="159734073">
+  <w:num w:numId="19" w16cid:durableId="425350269">
     <w:abstractNumId w:val="9"/>
-  </w:num>
-  <w:num w:numId="17" w16cid:durableId="1307856197">
-    <w:abstractNumId w:val="10"/>
   </w:num>
 </w:numbering>
 </file>

</xml_diff>